<commit_message>
docs(governanca): entrega os DOCX dos RIA-022 e RIA-023 e corrige o exportador
- regenera o DOCX do RIA-022 com rodapé RIA-022, metadados da Equipe FluxID e totais de testes uniformes
- entrega o DOCX do RIA-023 e aponta o índice para ele
- exportador preserva a tag raiz e os prefixos do modelo: o Word recusava os DOCX gerados como corrompidos
</commit_message>
<xml_diff>
--- a/docs/governanca-ia/registros/22_Cilindros_Identificadores_Estoque_e_Historico.docx
+++ b/docs/governanca-ia/registros/22_Cilindros_Identificadores_Estoque_e_Historico.docx
@@ -1,6 +1,6 @@
 
 <file path=word/document.xml><?xml version="1.0" encoding="utf-8"?>
-<w:document xmlns:ns1="http://schemas.openxmlformats.org/markup-compatibility/2006" xmlns:r="http://schemas.openxmlformats.org/officeDocument/2006/relationships" xmlns:w="http://schemas.openxmlformats.org/wordprocessingml/2006/main" xmlns:w14="http://schemas.microsoft.com/office/word/2010/wordml" ns1:Ignorable="w14 wp14">
+<w:document xmlns:wpc="http://schemas.microsoft.com/office/word/2010/wordprocessingCanvas" xmlns:mo="http://schemas.microsoft.com/office/mac/office/2008/main" xmlns:mc="http://schemas.openxmlformats.org/markup-compatibility/2006" xmlns:mv="urn:schemas-microsoft-com:mac:vml" xmlns:o="urn:schemas-microsoft-com:office:office" xmlns:r="http://schemas.openxmlformats.org/officeDocument/2006/relationships" xmlns:m="http://schemas.openxmlformats.org/officeDocument/2006/math" xmlns:v="urn:schemas-microsoft-com:vml" xmlns:wp14="http://schemas.microsoft.com/office/word/2010/wordprocessingDrawing" xmlns:wp="http://schemas.openxmlformats.org/drawingml/2006/wordprocessingDrawing" xmlns:w10="urn:schemas-microsoft-com:office:word" xmlns:w="http://schemas.openxmlformats.org/wordprocessingml/2006/main" xmlns:w14="http://schemas.microsoft.com/office/word/2010/wordml" xmlns:wpg="http://schemas.microsoft.com/office/word/2010/wordprocessingGroup" xmlns:wpi="http://schemas.microsoft.com/office/word/2010/wordprocessingInk" xmlns:wne="http://schemas.microsoft.com/office/word/2006/wordml" xmlns:wps="http://schemas.microsoft.com/office/word/2010/wordprocessingShape" mc:Ignorable="w14 wp14">
   <w:body>
     <w:sectPr>
       <w:footerReference w:type="default" r:id="rId9"/>
@@ -761,7 +761,7 @@
                 <w:color w:val="000000"/>
                 <w:sz w:val="19"/>
               </w:rPr>
-              <w:t>Resultados conferidos por lint, tipagem, 1905 testes de unidade, 897 testes pgTAP, 92 testes live, 1145 testes E2E e build com pacote de entrada de 579,55 kB (limite 593,95 kB). A rodada final achou e corrigiu: expectativas desatualizadas do teste live de permissões, a medição de 50 mil cilindros rodando fora do projeto próprio, ícones do menu caindo no genérico e uma classe fora dos tokens. As suítes pgTAP de auditoria exigem base limpa (db reset). A leitura por câmera só aparece onde o navegador tem BarcodeDetector (Chrome no Android) e não foi testada com câmera real pela IA.</w:t>
+              <w:t>Resultados conferidos por lint, tipagem, 1919 testes de unidade, 897 testes pgTAP, 92 testes live, 1148 testes E2E e build com pacote de entrada de 579,54 kB (limite 593,95 kB). Depois do merge, a CI da main reprovou o E2E de teste hidrostático por causa do fuso: o teste calculava "hoje" em UTC, que entre 21h e 24h em São Paulo já é o dia seguinte e o formulário recusa como data futura. A causa estava no teste e no simulado, não no sistema; foi corrigida em fix/006-pos-merge-convergencia com todayInSaoPaulo() e soma de dias no calendário civil, com regressão para esse intervalo. A mesma correção fez a leitura por câmera consultar BarcodeDetector.getSupportedFormats(). A rodada final achou e corrigiu: expectativas desatualizadas do teste live de permissões, a medição de 50 mil cilindros rodando fora do projeto próprio, ícones do menu caindo no genérico e uma classe fora dos tokens. As suítes pgTAP de auditoria exigem base limpa (db reset). A leitura por câmera só aparece onde o navegador tem BarcodeDetector (Chrome no Android) e não foi testada com câmera real pela IA.</w:t>
             </w:r>
           </w:p>
         </w:tc>
@@ -1235,7 +1235,7 @@
                 <w:color w:val="000000"/>
                 <w:sz w:val="19"/>
               </w:rPr>
-              <w:t>O link de revisão foi trocado pelo do pull request #17 em 05/10/2026. Falta entregar o DOCX do RIA depois do merge.</w:t>
+              <w:t>O link de revisão foi trocado pelo do pull request #17 em 05/10/2026. O DOCX do RIA foi entregue pelo pull request #18 e, depois do ciclo corretivo do PR #19, regenerado com o rodapé, os totais de testes e os metadados corrigidos.</w:t>
             </w:r>
           </w:p>
         </w:tc>
@@ -1526,7 +1526,7 @@
                 <w:color w:val="000000"/>
                 <w:sz w:val="19"/>
               </w:rPr>
-              <w:t>Comandos: `npm run lint`, `npm run typecheck`, `npm run test:coverage`, `npx supabase db reset` e `npx supabase test db`, `npm run test:live`, `npm run build`, `npm run test:e2e`, `npm run test:visual:atualizar` e `npm run test:desempenho:cilindros`.. Resultado: aprovado. Evidência: lint e typecheck sem erros; 152 arquivos e 1906 testes de unidade (cobertura de linhas 94,77%); 897 testes pgTAP; 92 testes live; 1145 testes E2E aprovados e 31 ignorados; 129 capturas visuais regeneradas no Linux; pacote de entrada de 579,55 kB (limite 593,95 kB); lista com 50 mil cilindros em 4G com p95 de 756 ms (limite 2000 ms). Detalhes em `specs/006-cilindros-e-estoque/validation.md`.</w:t>
+              <w:t>Comandos: npm run lint, npm run typecheck, npm run test:coverage, npx supabase db reset e npx supabase test db, npm run test:live, npm run build, npm run test:e2e, npm run test:visual:atualizar e npm run test:desempenho:cilindros. Resultado: aprovado. Evidência: lint e typecheck sem erros; 152 arquivos e 1919 testes de unidade (cobertura de linhas 94,75%); 897 testes pgTAP; 92 testes live; 1148 testes E2E aprovados e 31 ignorados; 129 capturas visuais regeneradas no Linux; pacote de entrada de 579,54 kB (limite 593,95 kB); lista com 50 mil cilindros em 4G com p95 de 756 ms (limite 2000 ms). Detalhes em specs/006-cilindros-e-estoque/validation.md.</w:t>
             </w:r>
           </w:p>
         </w:tc>
@@ -1598,7 +1598,7 @@
                 <w:color w:val="000000"/>
                 <w:sz w:val="19"/>
               </w:rPr>
-              <w:t>231 arquivos. A lista completa está no Markdown de apoio do registro.</w:t>
+              <w:t>231 arquivos, sem contar os arquivos administrativos do próprio registro em docs/governanca-ia (o RIA e o índice). A lista completa está no Markdown de apoio do registro.</w:t>
             </w:r>
           </w:p>
         </w:tc>
@@ -2005,7 +2005,7 @@
         <w:color w:val="646464"/>
         <w:sz w:val="16"/>
       </w:rPr>
-      <w:t>INTEGRA SENAI 2026  |  FluxID  |  RIA-013</w:t>
+      <w:t>INTEGRA SENAI 2026  |  FluxID  |  RIA-022</w:t>
     </w:r>
   </w:p>
 </w:ftr>

</xml_diff>